<commit_message>
First functionalities + test code ready
</commit_message>
<xml_diff>
--- a/Harjoitusprojekti1/Raportti_Harjoitusprojekti1.docx
+++ b/Harjoitusprojekti1/Raportti_Harjoitusprojekti1.docx
@@ -119,19 +119,6 @@
     </w:p>
     <w:p>
       <w:pPr>
-        <w:rPr>
-          <w:lang w:val="fi-FI"/>
-        </w:rPr>
-      </w:pPr>
-      <w:r>
-        <w:rPr>
-          <w:lang w:val="fi-FI"/>
-        </w:rPr>
-        <w:t xml:space="preserve">Kerro, miksi projekti tehtiin ja mitä ohjelmointikäsitteitä harjoituksessa </w:t>
-      </w:r>
-    </w:p>
-    <w:p>
-      <w:pPr>
         <w:pStyle w:val="Otsikko2"/>
         <w:rPr>
           <w:color w:val="auto"/>
@@ -403,7 +390,21 @@
         <w:rPr>
           <w:lang w:val="fi-FI"/>
         </w:rPr>
-        <w:t>sanakirjaan (dictionary), joista toisen avaimen arvona on lista.</w:t>
+        <w:t>sanakirjaan (</w:t>
+      </w:r>
+      <w:proofErr w:type="spellStart"/>
+      <w:r>
+        <w:rPr>
+          <w:lang w:val="fi-FI"/>
+        </w:rPr>
+        <w:t>dictionary</w:t>
+      </w:r>
+      <w:proofErr w:type="spellEnd"/>
+      <w:r>
+        <w:rPr>
+          <w:lang w:val="fi-FI"/>
+        </w:rPr>
+        <w:t>), joista toisen avaimen arvona on lista.</w:t>
       </w:r>
     </w:p>
     <w:p>
@@ -416,8 +417,21 @@
         <w:rPr>
           <w:lang w:val="fi-FI"/>
         </w:rPr>
-        <w:lastRenderedPageBreak/>
-        <w:t>Ohjelmassa käytettiin lisäksi mm. toistorakenteita (foreach) varaston läpikäynnissä tulostuksessa, ja ehtolauseita mm. saldojen vertailuun, löytyykö tuotteita yms.</w:t>
+        <w:t>Ohjelmassa käytettiin lisäksi mm. toistorakenteita (</w:t>
+      </w:r>
+      <w:proofErr w:type="spellStart"/>
+      <w:r>
+        <w:rPr>
+          <w:lang w:val="fi-FI"/>
+        </w:rPr>
+        <w:t>foreach</w:t>
+      </w:r>
+      <w:proofErr w:type="spellEnd"/>
+      <w:r>
+        <w:rPr>
+          <w:lang w:val="fi-FI"/>
+        </w:rPr>
+        <w:t>) varaston läpikäynnissä tulostuksessa, ja ehtolauseita mm. saldojen vertailuun, löytyykö tuotteita yms.</w:t>
       </w:r>
     </w:p>
     <w:p>
@@ -430,6 +444,7 @@
         <w:rPr>
           <w:lang w:val="fi-FI"/>
         </w:rPr>
+        <w:lastRenderedPageBreak/>
         <w:t xml:space="preserve">Tärkeimmät metodit: </w:t>
       </w:r>
     </w:p>
@@ -467,12 +482,14 @@
         </w:rPr>
       </w:pPr>
       <w:hyperlink r:id="rId8" w:history="1">
+        <w:proofErr w:type="spellStart"/>
         <w:r>
           <w:rPr>
             <w:lang w:val="fi-FI"/>
           </w:rPr>
           <w:t>PrintStock</w:t>
         </w:r>
+        <w:proofErr w:type="spellEnd"/>
       </w:hyperlink>
       <w:r>
         <w:rPr>
@@ -498,12 +515,14 @@
         </w:rPr>
       </w:pPr>
       <w:hyperlink r:id="rId9" w:history="1">
+        <w:proofErr w:type="spellStart"/>
         <w:r>
           <w:rPr>
             <w:lang w:val="fi-FI"/>
           </w:rPr>
           <w:t>AddOrIncrease</w:t>
         </w:r>
+        <w:proofErr w:type="spellEnd"/>
       </w:hyperlink>
       <w:r>
         <w:rPr>
@@ -529,12 +548,14 @@
         </w:rPr>
       </w:pPr>
       <w:hyperlink r:id="rId10" w:history="1">
+        <w:proofErr w:type="spellStart"/>
         <w:r>
           <w:rPr>
             <w:lang w:val="fi-FI"/>
           </w:rPr>
           <w:t>TrySell</w:t>
         </w:r>
+        <w:proofErr w:type="spellEnd"/>
       </w:hyperlink>
       <w:r>
         <w:rPr>
@@ -554,12 +575,14 @@
         </w:rPr>
       </w:pPr>
       <w:hyperlink r:id="rId11" w:history="1">
+        <w:proofErr w:type="spellStart"/>
         <w:r>
           <w:rPr>
             <w:lang w:val="fi-FI"/>
           </w:rPr>
           <w:t>RemoveProduct</w:t>
         </w:r>
+        <w:proofErr w:type="spellEnd"/>
       </w:hyperlink>
       <w:r>
         <w:rPr>
@@ -579,12 +602,14 @@
         </w:rPr>
       </w:pPr>
       <w:hyperlink r:id="rId12" w:history="1">
+        <w:proofErr w:type="spellStart"/>
         <w:r>
           <w:rPr>
             <w:lang w:val="fi-FI"/>
           </w:rPr>
           <w:t>AddToCategory</w:t>
         </w:r>
+        <w:proofErr w:type="spellEnd"/>
       </w:hyperlink>
       <w:r>
         <w:rPr>
@@ -604,12 +629,14 @@
         </w:rPr>
       </w:pPr>
       <w:hyperlink r:id="rId13" w:history="1">
+        <w:proofErr w:type="spellStart"/>
         <w:r>
           <w:rPr>
             <w:lang w:val="fi-FI"/>
           </w:rPr>
           <w:t>PrintCategories</w:t>
         </w:r>
+        <w:proofErr w:type="spellEnd"/>
       </w:hyperlink>
       <w:r>
         <w:rPr>
@@ -689,7 +716,21 @@
         <w:rPr>
           <w:lang w:val="fi-FI"/>
         </w:rPr>
-        <w:t>Luodaan tietovarasto/sanakirja (stock)</w:t>
+        <w:t>Luodaan tietovarasto/sanakirja (</w:t>
+      </w:r>
+      <w:proofErr w:type="spellStart"/>
+      <w:r>
+        <w:rPr>
+          <w:lang w:val="fi-FI"/>
+        </w:rPr>
+        <w:t>stock</w:t>
+      </w:r>
+      <w:proofErr w:type="spellEnd"/>
+      <w:r>
+        <w:rPr>
+          <w:lang w:val="fi-FI"/>
+        </w:rPr>
+        <w:t>)</w:t>
       </w:r>
     </w:p>
     <w:p>
@@ -707,7 +748,21 @@
         <w:rPr>
           <w:lang w:val="fi-FI"/>
         </w:rPr>
-        <w:t>Luodaan tietovarasto/sanakirja (categories), jonka arvoina listat</w:t>
+        <w:t>Luodaan tietovarasto/sanakirja (</w:t>
+      </w:r>
+      <w:proofErr w:type="spellStart"/>
+      <w:r>
+        <w:rPr>
+          <w:lang w:val="fi-FI"/>
+        </w:rPr>
+        <w:t>categories</w:t>
+      </w:r>
+      <w:proofErr w:type="spellEnd"/>
+      <w:r>
+        <w:rPr>
+          <w:lang w:val="fi-FI"/>
+        </w:rPr>
+        <w:t>), jonka arvoina listat</w:t>
       </w:r>
     </w:p>
     <w:p>
@@ -725,7 +780,65 @@
         <w:rPr>
           <w:lang w:val="fi-FI"/>
         </w:rPr>
-        <w:t>testataan metodien toimintaa erilaisilla tuotteiden lisäyksillä, poistoilla, tulostuksilla yms: stock.Add (metodikutsu), AddOrIncrease, TrySell,</w:t>
+        <w:t xml:space="preserve">testataan metodien toimintaa erilaisilla tuotteiden lisäyksillä, poistoilla, tulostuksilla </w:t>
+      </w:r>
+      <w:proofErr w:type="spellStart"/>
+      <w:r>
+        <w:rPr>
+          <w:lang w:val="fi-FI"/>
+        </w:rPr>
+        <w:t>yms</w:t>
+      </w:r>
+      <w:proofErr w:type="spellEnd"/>
+      <w:r>
+        <w:rPr>
+          <w:lang w:val="fi-FI"/>
+        </w:rPr>
+        <w:t xml:space="preserve">: </w:t>
+      </w:r>
+      <w:proofErr w:type="spellStart"/>
+      <w:proofErr w:type="gramStart"/>
+      <w:r>
+        <w:rPr>
+          <w:lang w:val="fi-FI"/>
+        </w:rPr>
+        <w:t>stock.Add</w:t>
+      </w:r>
+      <w:proofErr w:type="spellEnd"/>
+      <w:proofErr w:type="gramEnd"/>
+      <w:r>
+        <w:rPr>
+          <w:lang w:val="fi-FI"/>
+        </w:rPr>
+        <w:t xml:space="preserve"> (metodikutsu), </w:t>
+      </w:r>
+      <w:proofErr w:type="spellStart"/>
+      <w:r>
+        <w:rPr>
+          <w:lang w:val="fi-FI"/>
+        </w:rPr>
+        <w:t>AddOrIncrease</w:t>
+      </w:r>
+      <w:proofErr w:type="spellEnd"/>
+      <w:r>
+        <w:rPr>
+          <w:lang w:val="fi-FI"/>
+        </w:rPr>
+        <w:t xml:space="preserve">, </w:t>
+      </w:r>
+      <w:proofErr w:type="spellStart"/>
+      <w:r>
+        <w:rPr>
+          <w:lang w:val="fi-FI"/>
+        </w:rPr>
+        <w:t>TrySell</w:t>
+      </w:r>
+      <w:proofErr w:type="spellEnd"/>
+      <w:r>
+        <w:rPr>
+          <w:lang w:val="fi-FI"/>
+        </w:rPr>
+        <w:t>,</w:t>
       </w:r>
       <w:r>
         <w:rPr>
@@ -733,11 +846,19 @@
         </w:rPr>
         <w:t xml:space="preserve"> </w:t>
       </w:r>
+      <w:proofErr w:type="spellStart"/>
       <w:r>
         <w:rPr>
           <w:lang w:val="fi-FI"/>
         </w:rPr>
-        <w:t>RemoveProduct jne.</w:t>
+        <w:t>RemoveProduct</w:t>
+      </w:r>
+      <w:proofErr w:type="spellEnd"/>
+      <w:r>
+        <w:rPr>
+          <w:lang w:val="fi-FI"/>
+        </w:rPr>
+        <w:t xml:space="preserve"> jne.</w:t>
       </w:r>
     </w:p>
     <w:p>
@@ -746,17 +867,39 @@
           <w:lang w:val="fi-FI"/>
         </w:rPr>
       </w:pPr>
+      <w:proofErr w:type="spellStart"/>
       <w:r>
         <w:rPr>
           <w:lang w:val="fi-FI"/>
         </w:rPr>
-        <w:t xml:space="preserve">PrintStock: </w:t>
+        <w:t>PrintStock</w:t>
+      </w:r>
+      <w:proofErr w:type="spellEnd"/>
+      <w:r>
+        <w:rPr>
+          <w:lang w:val="fi-FI"/>
+        </w:rPr>
+        <w:t xml:space="preserve">: </w:t>
       </w:r>
       <w:r>
         <w:rPr>
           <w:lang w:val="fi-FI"/>
         </w:rPr>
-        <w:t xml:space="preserve">(input stock) </w:t>
+        <w:t xml:space="preserve">(input </w:t>
+      </w:r>
+      <w:proofErr w:type="spellStart"/>
+      <w:r>
+        <w:rPr>
+          <w:lang w:val="fi-FI"/>
+        </w:rPr>
+        <w:t>stock</w:t>
+      </w:r>
+      <w:proofErr w:type="spellEnd"/>
+      <w:r>
+        <w:rPr>
+          <w:lang w:val="fi-FI"/>
+        </w:rPr>
+        <w:t xml:space="preserve">) </w:t>
       </w:r>
       <w:r>
         <w:rPr>
@@ -804,7 +947,21 @@
         <w:rPr>
           <w:lang w:val="fi-FI"/>
         </w:rPr>
-        <w:t>käy läpi jokaisen arvo – avainoparin sanakirjasta ja tulostaa ne</w:t>
+        <w:t xml:space="preserve">käy läpi jokaisen arvo – </w:t>
+      </w:r>
+      <w:proofErr w:type="spellStart"/>
+      <w:r>
+        <w:rPr>
+          <w:lang w:val="fi-FI"/>
+        </w:rPr>
+        <w:t>avainoparin</w:t>
+      </w:r>
+      <w:proofErr w:type="spellEnd"/>
+      <w:r>
+        <w:rPr>
+          <w:lang w:val="fi-FI"/>
+        </w:rPr>
+        <w:t xml:space="preserve"> sanakirjasta ja tulostaa ne</w:t>
       </w:r>
     </w:p>
     <w:p>
@@ -813,23 +970,45 @@
           <w:lang w:val="fi-FI"/>
         </w:rPr>
       </w:pPr>
+      <w:proofErr w:type="spellStart"/>
       <w:r>
         <w:rPr>
           <w:lang w:val="fi-FI"/>
         </w:rPr>
-        <w:t xml:space="preserve">AddOrIncrease: </w:t>
+        <w:t>AddOrIncrease</w:t>
+      </w:r>
+      <w:proofErr w:type="spellEnd"/>
+      <w:r>
+        <w:rPr>
+          <w:lang w:val="fi-FI"/>
+        </w:rPr>
+        <w:t xml:space="preserve">: </w:t>
       </w:r>
       <w:r>
         <w:rPr>
           <w:lang w:val="fi-FI"/>
         </w:rPr>
-        <w:t xml:space="preserve">(in varasto, tuote, määrä)  </w:t>
+        <w:t xml:space="preserve">(in varasto, tuote, </w:t>
+      </w:r>
+      <w:proofErr w:type="gramStart"/>
+      <w:r>
+        <w:rPr>
+          <w:lang w:val="fi-FI"/>
+        </w:rPr>
+        <w:t xml:space="preserve">määrä)  </w:t>
       </w:r>
       <w:r>
         <w:rPr>
           <w:lang w:val="fi-FI"/>
         </w:rPr>
-        <w:t>lisää uuden tuotteen tai kasvattaa määrää.</w:t>
+        <w:t>lisää</w:t>
+      </w:r>
+      <w:proofErr w:type="gramEnd"/>
+      <w:r>
+        <w:rPr>
+          <w:lang w:val="fi-FI"/>
+        </w:rPr>
+        <w:t xml:space="preserve"> uuden tuotteen tai kasvattaa määrää.</w:t>
       </w:r>
     </w:p>
     <w:p>
@@ -874,11 +1053,19 @@
           <w:lang w:val="fi-FI"/>
         </w:rPr>
       </w:pPr>
+      <w:proofErr w:type="spellStart"/>
       <w:r>
         <w:rPr>
           <w:lang w:val="fi-FI"/>
         </w:rPr>
-        <w:t>TrySell:</w:t>
+        <w:t>TrySell</w:t>
+      </w:r>
+      <w:proofErr w:type="spellEnd"/>
+      <w:r>
+        <w:rPr>
+          <w:lang w:val="fi-FI"/>
+        </w:rPr>
+        <w:t>:</w:t>
       </w:r>
       <w:r>
         <w:rPr>
@@ -890,19 +1077,7 @@
         <w:rPr>
           <w:lang w:val="fi-FI"/>
         </w:rPr>
-        <w:t>(</w:t>
-      </w:r>
-      <w:r>
-        <w:rPr>
-          <w:lang w:val="fi-FI"/>
-        </w:rPr>
-        <w:t>in varasto, tuote, määrä</w:t>
-      </w:r>
-      <w:r>
-        <w:rPr>
-          <w:lang w:val="fi-FI"/>
-        </w:rPr>
-        <w:t>)</w:t>
+        <w:t>(in varasto, tuote, määrä)</w:t>
       </w:r>
       <w:r>
         <w:rPr>
@@ -922,11 +1097,19 @@
           <w:lang w:val="fi-FI"/>
         </w:rPr>
       </w:pPr>
+      <w:proofErr w:type="gramStart"/>
       <w:r>
         <w:rPr>
           <w:lang w:val="fi-FI"/>
         </w:rPr>
-        <w:t>tarkistetaan onko tuotetta varastossa -&gt; jos ei -&gt; virheilmoitus</w:t>
+        <w:t>tarkistetaan onko</w:t>
+      </w:r>
+      <w:proofErr w:type="gramEnd"/>
+      <w:r>
+        <w:rPr>
+          <w:lang w:val="fi-FI"/>
+        </w:rPr>
+        <w:t xml:space="preserve"> tuotetta varastossa -&gt; jos ei -&gt; virheilmoitus</w:t>
       </w:r>
     </w:p>
     <w:p>
@@ -944,7 +1127,21 @@
         <w:rPr>
           <w:lang w:val="fi-FI"/>
         </w:rPr>
-        <w:t>jos on varastossa, tarkistetaan onko saldoa riittävästi myyntimäärään -&gt; jos ei -&gt; virheilmoitus</w:t>
+        <w:t xml:space="preserve">jos on varastossa, </w:t>
+      </w:r>
+      <w:proofErr w:type="gramStart"/>
+      <w:r>
+        <w:rPr>
+          <w:lang w:val="fi-FI"/>
+        </w:rPr>
+        <w:t>tarkistetaan onko</w:t>
+      </w:r>
+      <w:proofErr w:type="gramEnd"/>
+      <w:r>
+        <w:rPr>
+          <w:lang w:val="fi-FI"/>
+        </w:rPr>
+        <w:t xml:space="preserve"> saldoa riittävästi myyntimäärään -&gt; jos ei -&gt; virheilmoitus</w:t>
       </w:r>
     </w:p>
     <w:p>
@@ -962,7 +1159,6 @@
         <w:rPr>
           <w:lang w:val="fi-FI"/>
         </w:rPr>
-        <w:lastRenderedPageBreak/>
         <w:t>muuten vähennetään myyty määrä varastosta ja tulostetaan myyty määrä + tuote</w:t>
       </w:r>
     </w:p>
@@ -972,11 +1168,19 @@
           <w:lang w:val="fi-FI"/>
         </w:rPr>
       </w:pPr>
+      <w:proofErr w:type="spellStart"/>
       <w:r>
         <w:rPr>
           <w:lang w:val="fi-FI"/>
         </w:rPr>
-        <w:t>RemoveProduct:</w:t>
+        <w:t>RemoveProduct</w:t>
+      </w:r>
+      <w:proofErr w:type="spellEnd"/>
+      <w:r>
+        <w:rPr>
+          <w:lang w:val="fi-FI"/>
+        </w:rPr>
+        <w:t>:</w:t>
       </w:r>
       <w:r>
         <w:rPr>
@@ -1012,6 +1216,7 @@
         <w:rPr>
           <w:lang w:val="fi-FI"/>
         </w:rPr>
+        <w:lastRenderedPageBreak/>
         <w:t xml:space="preserve">kokeillaan poistaa tuotetta listalta -&gt; </w:t>
       </w:r>
       <w:r>
@@ -1045,11 +1250,19 @@
           <w:lang w:val="fi-FI"/>
         </w:rPr>
       </w:pPr>
+      <w:proofErr w:type="spellStart"/>
       <w:r>
         <w:rPr>
           <w:lang w:val="fi-FI"/>
         </w:rPr>
-        <w:t>AddToCategory:</w:t>
+        <w:t>AddToCategory</w:t>
+      </w:r>
+      <w:proofErr w:type="spellEnd"/>
+      <w:r>
+        <w:rPr>
+          <w:lang w:val="fi-FI"/>
+        </w:rPr>
+        <w:t>:</w:t>
       </w:r>
       <w:r>
         <w:rPr>
@@ -1063,12 +1276,14 @@
         </w:rPr>
         <w:t xml:space="preserve">in </w:t>
       </w:r>
+      <w:proofErr w:type="spellStart"/>
       <w:r>
         <w:rPr>
           <w:lang w:val="fi-FI"/>
         </w:rPr>
         <w:t>categories</w:t>
       </w:r>
+      <w:proofErr w:type="spellEnd"/>
       <w:r>
         <w:rPr>
           <w:lang w:val="fi-FI"/>
@@ -1136,17 +1351,33 @@
           <w:lang w:val="fi-FI"/>
         </w:rPr>
       </w:pPr>
+      <w:proofErr w:type="spellStart"/>
       <w:r>
         <w:rPr>
           <w:lang w:val="fi-FI"/>
         </w:rPr>
         <w:t>PrintCategories</w:t>
       </w:r>
+      <w:proofErr w:type="spellEnd"/>
       <w:r>
         <w:rPr>
           <w:lang w:val="fi-FI"/>
         </w:rPr>
-        <w:t>: (in categories)</w:t>
+        <w:t xml:space="preserve">: (in </w:t>
+      </w:r>
+      <w:proofErr w:type="spellStart"/>
+      <w:r>
+        <w:rPr>
+          <w:lang w:val="fi-FI"/>
+        </w:rPr>
+        <w:t>categories</w:t>
+      </w:r>
+      <w:proofErr w:type="spellEnd"/>
+      <w:r>
+        <w:rPr>
+          <w:lang w:val="fi-FI"/>
+        </w:rPr>
+        <w:t>)</w:t>
       </w:r>
       <w:r>
         <w:rPr>
@@ -2592,6 +2823,7 @@
   <w:style w:type="character" w:default="1" w:styleId="Kappaleenoletusfontti">
     <w:name w:val="Default Paragraph Font"/>
     <w:uiPriority w:val="1"/>
+    <w:semiHidden/>
     <w:unhideWhenUsed/>
   </w:style>
   <w:style w:type="table" w:default="1" w:styleId="Normaalitaulukko">

</xml_diff>